<commit_message>
fix: bold statement, SM/Product batch logic, TEST field dynamic
</commit_message>
<xml_diff>
--- a/api/Method_Validation_Report.docx
+++ b/api/Method_Validation_Report.docx
@@ -159,7 +159,7 @@
                 <w:b/>
                 <w:bCs/>
               </w:rPr>
-              <w:t>balafil</w:t>
+              <w:t>sildenafil</w:t>
             </w:r>
           </w:p>
         </w:tc>
@@ -208,7 +208,7 @@
               <w:rPr>
                 <w:bCs/>
               </w:rPr>
-              <w:t>Assay of Avanafil</w:t>
+              <w:t>Assay of sildenafil</w:t>
             </w:r>
             <w:r>
               <w:rPr>
@@ -1452,7 +1452,7 @@
                 <w:b/>
                 <w:bCs/>
               </w:rPr>
-              <w:t xml:space="preserve">balafil Working Standard # 1546</w:t>
+              <w:t xml:space="preserve">sildenafil Working Standard # 1546</w:t>
             </w:r>
             <w:r>
               <w:rPr>
@@ -1482,43 +1482,12 @@
             </w:pPr>
             <w:r>
               <w:rPr>
-                <w:b/>
-                <w:sz w:val="22"/>
-                <w:szCs w:val="22"/>
-              </w:rPr>
-              <w:t>Avanafil Starting Material B</w:t>
-            </w:r>
-            <w:r>
-              <w:rPr>
-                <w:b/>
-                <w:sz w:val="22"/>
-                <w:szCs w:val="22"/>
-              </w:rPr>
-              <w:t xml:space="preserve"> </w:t>
-            </w:r>
-            <w:r>
-              <w:rPr>
-                <w:b/>
-                <w:sz w:val="22"/>
-                <w:szCs w:val="22"/>
-              </w:rPr>
-              <w:t>#</w:t>
-            </w:r>
-            <w:r>
-              <w:rPr>
-                <w:b/>
-                <w:sz w:val="22"/>
-                <w:szCs w:val="22"/>
-              </w:rPr>
-              <w:t xml:space="preserve"> </w:t>
-            </w:r>
-            <w:r>
-              <w:rPr>
-                <w:b/>
-                <w:sz w:val="22"/>
-                <w:szCs w:val="22"/>
-              </w:rPr>
-              <w:t>15048002-AVN</w:t>
+                <w:sz w:val="22"/>
+                <w:szCs w:val="22"/>
+                <w:b/>
+                <w:bCs/>
+              </w:rPr>
+              <w:t xml:space="preserve">Tadalafil 200mg Tablets Batch # 15048002-AVN, 4, 5</w:t>
             </w:r>
           </w:p>
           <w:p>
@@ -18353,7 +18322,7 @@
                 <w:b/>
                 <w:bCs/>
               </w:rPr>
-              <w:t xml:space="preserve">balafil</w:t>
+              <w:t xml:space="preserve">sildenafil</w:t>
             </w:r>
             <w:r>
               <w:rPr>
@@ -18369,7 +18338,7 @@
                 <w:b/>
                 <w:bCs/>
               </w:rPr>
-              <w:t xml:space="preserve">balafil</w:t>
+              <w:t xml:space="preserve">sildenafil</w:t>
             </w:r>
             <w:r>
               <w:rPr>
@@ -18639,7 +18608,7 @@
                 <w:b/>
                 <w:bCs/>
               </w:rPr>
-              <w:t xml:space="preserve">balafil</w:t>
+              <w:t xml:space="preserve">Tadalafil 200mg Tablets</w:t>
             </w:r>
             <w:r>
               <w:rPr>
@@ -19013,7 +18982,7 @@
                 <w:b/>
                 <w:bCs/>
               </w:rPr>
-              <w:t xml:space="preserve">balafil Starting Material</w:t>
+              <w:t xml:space="preserve">Tadalafil 200mg Tablets</w:t>
             </w:r>
             <w:r>
               <w:rPr>
@@ -19161,7 +19130,14 @@
                 <w:sz w:val="22"/>
                 <w:szCs w:val="22"/>
               </w:rPr>
-              <w:t xml:space="preserve">All the results of the tests carried out for the validation of the method are in complete agreement with the required limits and criteria. Method being used for the determination of </w:t>
+              <w:t xml:space="preserve">All the results of the tests carried out for the validation of the method are in complete agreement with the required limits and criteria. Method being used for the </w:t>
+            </w:r>
+            <w:r>
+              <w:rPr>
+                <w:sz w:val="22"/>
+                <w:szCs w:val="22"/>
+              </w:rPr>
+              <w:t xml:space="preserve">determination of </w:t>
             </w:r>
             <w:r>
               <w:rPr>
@@ -19170,14 +19146,21 @@
                 <w:b/>
                 <w:bCs/>
               </w:rPr>
-              <w:t xml:space="preserve">balafil</w:t>
-            </w:r>
-            <w:r>
-              <w:rPr>
-                <w:sz w:val="22"/>
-                <w:szCs w:val="22"/>
-              </w:rPr>
-              <w:t xml:space="preserve"> produces consistent, reproducible and reliable results therefore it is suitable for its intended purpose i.e. quantification of </w:t>
+              <w:t xml:space="preserve">sildenafil</w:t>
+            </w:r>
+            <w:r>
+              <w:rPr>
+                <w:sz w:val="22"/>
+                <w:szCs w:val="22"/>
+              </w:rPr>
+              <w:t xml:space="preserve"> produces consistent, reproducible and reliable results therefore it is suitable for its intended purpose i.e. </w:t>
+            </w:r>
+            <w:r>
+              <w:rPr>
+                <w:sz w:val="22"/>
+                <w:szCs w:val="22"/>
+              </w:rPr>
+              <w:t xml:space="preserve">quantification of </w:t>
             </w:r>
             <w:r>
               <w:rPr>
@@ -19186,7 +19169,7 @@
                 <w:b/>
                 <w:bCs/>
               </w:rPr>
-              <w:t xml:space="preserve">balafil</w:t>
+              <w:t xml:space="preserve">Tadalafil 200mg Tablets</w:t>
             </w:r>
             <w:r>
               <w:rPr>

</xml_diff>